<commit_message>
Deploy preview for PR 581 🛫
</commit_message>
<xml_diff>
--- a/pr-preview/pr-581/vignettes/articles/version-crosswalk-1.3-to-1.4.docx
+++ b/pr-preview/pr-581/vignettes/articles/version-crosswalk-1.3-to-1.4.docx
@@ -1699,70 +1699,70 @@
         <w:rPr>
           <w:rStyle w:val="VerbatimChar"/>
         </w:rPr>
-        <w:t xml:space="preserve">#&gt;     age id    antigen_iso    value</w:t>
-      </w:r>
-      <w:r>
-        <w:br/>
-      </w:r>
-      <w:r>
-        <w:rPr>
-          <w:rStyle w:val="VerbatimChar"/>
-        </w:rPr>
-        <w:t xml:space="preserve">#&gt;   &lt;dbl&gt; &lt;chr&gt; &lt;chr&gt;          &lt;dbl&gt;</w:t>
-      </w:r>
-      <w:r>
-        <w:br/>
-      </w:r>
-      <w:r>
-        <w:rPr>
-          <w:rStyle w:val="VerbatimChar"/>
-        </w:rPr>
-        <w:t xml:space="preserve">#&gt; 1 10.3  1     HlyE_IgA       0.401</w:t>
-      </w:r>
-      <w:r>
-        <w:br/>
-      </w:r>
-      <w:r>
-        <w:rPr>
-          <w:rStyle w:val="VerbatimChar"/>
-        </w:rPr>
-        <w:t xml:space="preserve">#&gt; 2 10.3  1     HlyE_IgG       0.461</w:t>
-      </w:r>
-      <w:r>
-        <w:br/>
-      </w:r>
-      <w:r>
-        <w:rPr>
-          <w:rStyle w:val="VerbatimChar"/>
-        </w:rPr>
-        <w:t xml:space="preserve">#&gt; 3 12.5  2     HlyE_IgA      10.5  </w:t>
-      </w:r>
-      <w:r>
-        <w:br/>
-      </w:r>
-      <w:r>
-        <w:rPr>
-          <w:rStyle w:val="VerbatimChar"/>
-        </w:rPr>
-        <w:t xml:space="preserve">#&gt; 4 12.5  2     HlyE_IgG    3196.   </w:t>
-      </w:r>
-      <w:r>
-        <w:br/>
-      </w:r>
-      <w:r>
-        <w:rPr>
-          <w:rStyle w:val="VerbatimChar"/>
-        </w:rPr>
-        <w:t xml:space="preserve">#&gt; 5  4.71 3     HlyE_IgA       0.763</w:t>
-      </w:r>
-      <w:r>
-        <w:br/>
-      </w:r>
-      <w:r>
-        <w:rPr>
-          <w:rStyle w:val="VerbatimChar"/>
-        </w:rPr>
-        <w:t xml:space="preserve">#&gt; 6  4.71 3     HlyE_IgG       0.788</w:t>
+        <w:t xml:space="preserve">#&gt;     age id    antigen_iso value</w:t>
+      </w:r>
+      <w:r>
+        <w:br/>
+      </w:r>
+      <w:r>
+        <w:rPr>
+          <w:rStyle w:val="VerbatimChar"/>
+        </w:rPr>
+        <w:t xml:space="preserve">#&gt;   &lt;dbl&gt; &lt;chr&gt; &lt;chr&gt;       &lt;dbl&gt;</w:t>
+      </w:r>
+      <w:r>
+        <w:br/>
+      </w:r>
+      <w:r>
+        <w:rPr>
+          <w:rStyle w:val="VerbatimChar"/>
+        </w:rPr>
+        <w:t xml:space="preserve">#&gt; 1  1.22 1     HlyE_IgA    0.815</w:t>
+      </w:r>
+      <w:r>
+        <w:br/>
+      </w:r>
+      <w:r>
+        <w:rPr>
+          <w:rStyle w:val="VerbatimChar"/>
+        </w:rPr>
+        <w:t xml:space="preserve">#&gt; 2  1.22 1     HlyE_IgG    0.745</w:t>
+      </w:r>
+      <w:r>
+        <w:br/>
+      </w:r>
+      <w:r>
+        <w:rPr>
+          <w:rStyle w:val="VerbatimChar"/>
+        </w:rPr>
+        <w:t xml:space="preserve">#&gt; 3 13.3  2     HlyE_IgA    0.619</w:t>
+      </w:r>
+      <w:r>
+        <w:br/>
+      </w:r>
+      <w:r>
+        <w:rPr>
+          <w:rStyle w:val="VerbatimChar"/>
+        </w:rPr>
+        <w:t xml:space="preserve">#&gt; 4 13.3  2     HlyE_IgG    0.521</w:t>
+      </w:r>
+      <w:r>
+        <w:br/>
+      </w:r>
+      <w:r>
+        <w:rPr>
+          <w:rStyle w:val="VerbatimChar"/>
+        </w:rPr>
+        <w:t xml:space="preserve">#&gt; 5 11.1  3     HlyE_IgA    2.00 </w:t>
+      </w:r>
+      <w:r>
+        <w:br/>
+      </w:r>
+      <w:r>
+        <w:rPr>
+          <w:rStyle w:val="VerbatimChar"/>
+        </w:rPr>
+        <w:t xml:space="preserve">#&gt; 6 11.1  3     HlyE_IgG    4.72</w:t>
       </w:r>
       <w:r>
         <w:br/>

</xml_diff>